<commit_message>
repair excel load data and add reference for methodology
</commit_message>
<xml_diff>
--- a/docx/descriptive/stats-log.docx
+++ b/docx/descriptive/stats-log.docx
@@ -689,7 +689,7 @@
                 <w:szCs w:val="22"/>
                 <w:color w:val="000000"/>
               </w:rPr>
-              <w:t xml:space="preserve">3.58</w:t>
+              <w:t xml:space="preserve">3.41</w:t>
             </w:r>
           </w:p>
         </w:tc>
@@ -915,7 +915,7 @@
                 <w:szCs w:val="22"/>
                 <w:color w:val="000000"/>
               </w:rPr>
-              <w:t xml:space="preserve">0.46</w:t>
+              <w:t xml:space="preserve">0.28</w:t>
             </w:r>
           </w:p>
         </w:tc>
@@ -1141,7 +1141,7 @@
                 <w:szCs w:val="22"/>
                 <w:color w:val="000000"/>
               </w:rPr>
-              <w:t xml:space="preserve">0.21</w:t>
+              <w:t xml:space="preserve">0.08</w:t>
             </w:r>
           </w:p>
         </w:tc>
@@ -1367,7 +1367,7 @@
                 <w:szCs w:val="22"/>
                 <w:color w:val="000000"/>
               </w:rPr>
-              <w:t xml:space="preserve">0.15</w:t>
+              <w:t xml:space="preserve">0.09</w:t>
             </w:r>
           </w:p>
         </w:tc>
@@ -1593,7 +1593,7 @@
                 <w:szCs w:val="22"/>
                 <w:color w:val="000000"/>
               </w:rPr>
-              <w:t xml:space="preserve">12.80</w:t>
+              <w:t xml:space="preserve">8.10</w:t>
             </w:r>
           </w:p>
         </w:tc>
@@ -1819,7 +1819,7 @@
                 <w:szCs w:val="22"/>
                 <w:color w:val="000000"/>
               </w:rPr>
-              <w:t xml:space="preserve">2.45</w:t>
+              <w:t xml:space="preserve">3.09</w:t>
             </w:r>
           </w:p>
         </w:tc>
@@ -2045,7 +2045,7 @@
                 <w:szCs w:val="22"/>
                 <w:color w:val="000000"/>
               </w:rPr>
-              <w:t xml:space="preserve">4.01</w:t>
+              <w:t xml:space="preserve">3.95</w:t>
             </w:r>
           </w:p>
         </w:tc>
@@ -2271,7 +2271,7 @@
                 <w:szCs w:val="22"/>
                 <w:color w:val="000000"/>
               </w:rPr>
-              <w:t xml:space="preserve">3.68</w:t>
+              <w:t xml:space="preserve">3.37</w:t>
             </w:r>
           </w:p>
         </w:tc>
@@ -2497,7 +2497,7 @@
                 <w:szCs w:val="22"/>
                 <w:color w:val="000000"/>
               </w:rPr>
-              <w:t xml:space="preserve">3.53</w:t>
+              <w:t xml:space="preserve">3.15</w:t>
             </w:r>
           </w:p>
         </w:tc>
@@ -2723,7 +2723,7 @@
                 <w:szCs w:val="22"/>
                 <w:color w:val="000000"/>
               </w:rPr>
-              <w:t xml:space="preserve">3.81</w:t>
+              <w:t xml:space="preserve">3.57</w:t>
             </w:r>
           </w:p>
         </w:tc>
@@ -2949,7 +2949,7 @@
                 <w:szCs w:val="22"/>
                 <w:color w:val="000000"/>
               </w:rPr>
-              <w:t xml:space="preserve">-1.49</w:t>
+              <w:t xml:space="preserve">0.58</w:t>
             </w:r>
           </w:p>
         </w:tc>
@@ -3401,7 +3401,7 @@
                 <w:szCs w:val="22"/>
                 <w:color w:val="000000"/>
               </w:rPr>
-              <w:t xml:space="preserve">3.19</w:t>
+              <w:t xml:space="preserve">3.76</w:t>
             </w:r>
           </w:p>
         </w:tc>
@@ -3627,7 +3627,7 @@
                 <w:szCs w:val="22"/>
                 <w:color w:val="000000"/>
               </w:rPr>
-              <w:t xml:space="preserve">0.49</w:t>
+              <w:t xml:space="preserve">0.23</w:t>
             </w:r>
           </w:p>
         </w:tc>
@@ -3853,7 +3853,7 @@
                 <w:szCs w:val="22"/>
                 <w:color w:val="000000"/>
               </w:rPr>
-              <w:t xml:space="preserve">0.24</w:t>
+              <w:t xml:space="preserve">0.05</w:t>
             </w:r>
           </w:p>
         </w:tc>
@@ -4079,7 +4079,7 @@
                 <w:szCs w:val="22"/>
                 <w:color w:val="000000"/>
               </w:rPr>
-              <w:t xml:space="preserve">0.16</w:t>
+              <w:t xml:space="preserve">0.08</w:t>
             </w:r>
           </w:p>
         </w:tc>
@@ -4305,7 +4305,7 @@
                 <w:szCs w:val="22"/>
                 <w:color w:val="000000"/>
               </w:rPr>
-              <w:t xml:space="preserve">15.38</w:t>
+              <w:t xml:space="preserve">6.08</w:t>
             </w:r>
           </w:p>
         </w:tc>
@@ -4531,7 +4531,7 @@
                 <w:szCs w:val="22"/>
                 <w:color w:val="000000"/>
               </w:rPr>
-              <w:t xml:space="preserve">1.98</w:t>
+              <w:t xml:space="preserve">3.50</w:t>
             </w:r>
           </w:p>
         </w:tc>
@@ -4757,7 +4757,7 @@
                 <w:szCs w:val="22"/>
                 <w:color w:val="000000"/>
               </w:rPr>
-              <w:t xml:space="preserve">3.63</w:t>
+              <w:t xml:space="preserve">4.15</w:t>
             </w:r>
           </w:p>
         </w:tc>
@@ -4983,7 +4983,7 @@
                 <w:szCs w:val="22"/>
                 <w:color w:val="000000"/>
               </w:rPr>
-              <w:t xml:space="preserve">3.32</w:t>
+              <w:t xml:space="preserve">3.77</w:t>
             </w:r>
           </w:p>
         </w:tc>
@@ -5209,7 +5209,7 @@
                 <w:szCs w:val="22"/>
                 <w:color w:val="000000"/>
               </w:rPr>
-              <w:t xml:space="preserve">3.15</w:t>
+              <w:t xml:space="preserve">3.54</w:t>
             </w:r>
           </w:p>
         </w:tc>
@@ -5435,7 +5435,7 @@
                 <w:szCs w:val="22"/>
                 <w:color w:val="000000"/>
               </w:rPr>
-              <w:t xml:space="preserve">3.42</w:t>
+              <w:t xml:space="preserve">3.91</w:t>
             </w:r>
           </w:p>
         </w:tc>
@@ -5661,7 +5661,7 @@
                 <w:szCs w:val="22"/>
                 <w:color w:val="000000"/>
               </w:rPr>
-              <w:t xml:space="preserve">-1.51</w:t>
+              <w:t xml:space="preserve">0.28</w:t>
             </w:r>
           </w:p>
         </w:tc>
@@ -6113,7 +6113,7 @@
                 <w:szCs w:val="22"/>
                 <w:color w:val="000000"/>
               </w:rPr>
-              <w:t xml:space="preserve">3.18</w:t>
+              <w:t xml:space="preserve">3.39</w:t>
             </w:r>
           </w:p>
         </w:tc>
@@ -6339,7 +6339,7 @@
                 <w:szCs w:val="22"/>
                 <w:color w:val="000000"/>
               </w:rPr>
-              <w:t xml:space="preserve">0.48</w:t>
+              <w:t xml:space="preserve">0.30</w:t>
             </w:r>
           </w:p>
         </w:tc>
@@ -6565,7 +6565,7 @@
                 <w:szCs w:val="22"/>
                 <w:color w:val="000000"/>
               </w:rPr>
-              <w:t xml:space="preserve">0.23</w:t>
+              <w:t xml:space="preserve">0.09</w:t>
             </w:r>
           </w:p>
         </w:tc>
@@ -6791,7 +6791,7 @@
                 <w:szCs w:val="22"/>
                 <w:color w:val="000000"/>
               </w:rPr>
-              <w:t xml:space="preserve">0.16</w:t>
+              <w:t xml:space="preserve">0.10</w:t>
             </w:r>
           </w:p>
         </w:tc>
@@ -7017,7 +7017,7 @@
                 <w:szCs w:val="22"/>
                 <w:color w:val="000000"/>
               </w:rPr>
-              <w:t xml:space="preserve">15.09</w:t>
+              <w:t xml:space="preserve">8.75</w:t>
             </w:r>
           </w:p>
         </w:tc>
@@ -7243,7 +7243,7 @@
                 <w:szCs w:val="22"/>
                 <w:color w:val="000000"/>
               </w:rPr>
-              <w:t xml:space="preserve">2.03</w:t>
+              <w:t xml:space="preserve">3.07</w:t>
             </w:r>
           </w:p>
         </w:tc>
@@ -7469,7 +7469,7 @@
                 <w:szCs w:val="22"/>
                 <w:color w:val="000000"/>
               </w:rPr>
-              <w:t xml:space="preserve">3.67</w:t>
+              <w:t xml:space="preserve">3.96</w:t>
             </w:r>
           </w:p>
         </w:tc>
@@ -7695,7 +7695,7 @@
                 <w:szCs w:val="22"/>
                 <w:color w:val="000000"/>
               </w:rPr>
-              <w:t xml:space="preserve">3.30</w:t>
+              <w:t xml:space="preserve">3.34</w:t>
             </w:r>
           </w:p>
         </w:tc>
@@ -7921,7 +7921,7 @@
                 <w:szCs w:val="22"/>
                 <w:color w:val="000000"/>
               </w:rPr>
-              <w:t xml:space="preserve">3.10</w:t>
+              <w:t xml:space="preserve">3.11</w:t>
             </w:r>
           </w:p>
         </w:tc>
@@ -8147,7 +8147,7 @@
                 <w:szCs w:val="22"/>
                 <w:color w:val="000000"/>
               </w:rPr>
-              <w:t xml:space="preserve">3.42</w:t>
+              <w:t xml:space="preserve">3.57</w:t>
             </w:r>
           </w:p>
         </w:tc>
@@ -8373,7 +8373,7 @@
                 <w:szCs w:val="22"/>
                 <w:color w:val="000000"/>
               </w:rPr>
-              <w:t xml:space="preserve">-1.35</w:t>
+              <w:t xml:space="preserve">0.53</w:t>
             </w:r>
           </w:p>
         </w:tc>
@@ -8825,7 +8825,7 @@
                 <w:szCs w:val="22"/>
                 <w:color w:val="000000"/>
               </w:rPr>
-              <w:t xml:space="preserve">3.17</w:t>
+              <w:t xml:space="preserve">3.36</w:t>
             </w:r>
           </w:p>
         </w:tc>
@@ -9051,7 +9051,7 @@
                 <w:szCs w:val="22"/>
                 <w:color w:val="000000"/>
               </w:rPr>
-              <w:t xml:space="preserve">0.45</w:t>
+              <w:t xml:space="preserve">0.26</w:t>
             </w:r>
           </w:p>
         </w:tc>
@@ -9277,7 +9277,7 @@
                 <w:szCs w:val="22"/>
                 <w:color w:val="000000"/>
               </w:rPr>
-              <w:t xml:space="preserve">0.20</w:t>
+              <w:t xml:space="preserve">0.07</w:t>
             </w:r>
           </w:p>
         </w:tc>
@@ -9503,7 +9503,7 @@
                 <w:szCs w:val="22"/>
                 <w:color w:val="000000"/>
               </w:rPr>
-              <w:t xml:space="preserve">0.15</w:t>
+              <w:t xml:space="preserve">0.09</w:t>
             </w:r>
           </w:p>
         </w:tc>
@@ -9729,7 +9729,7 @@
                 <w:szCs w:val="22"/>
                 <w:color w:val="000000"/>
               </w:rPr>
-              <w:t xml:space="preserve">14.04</w:t>
+              <w:t xml:space="preserve">7.79</w:t>
             </w:r>
           </w:p>
         </w:tc>
@@ -9955,7 +9955,7 @@
                 <w:szCs w:val="22"/>
                 <w:color w:val="000000"/>
               </w:rPr>
-              <w:t xml:space="preserve">2.10</w:t>
+              <w:t xml:space="preserve">3.05</w:t>
             </w:r>
           </w:p>
         </w:tc>
@@ -10181,7 +10181,7 @@
                 <w:szCs w:val="22"/>
                 <w:color w:val="000000"/>
               </w:rPr>
-              <w:t xml:space="preserve">3.60</w:t>
+              <w:t xml:space="preserve">3.83</w:t>
             </w:r>
           </w:p>
         </w:tc>
@@ -10407,7 +10407,7 @@
                 <w:szCs w:val="22"/>
                 <w:color w:val="000000"/>
               </w:rPr>
-              <w:t xml:space="preserve">3.29</w:t>
+              <w:t xml:space="preserve">3.33</w:t>
             </w:r>
           </w:p>
         </w:tc>
@@ -10859,7 +10859,7 @@
                 <w:szCs w:val="22"/>
                 <w:color w:val="000000"/>
               </w:rPr>
-              <w:t xml:space="preserve">3.40</w:t>
+              <w:t xml:space="preserve">3.56</w:t>
             </w:r>
           </w:p>
         </w:tc>
@@ -11085,7 +11085,7 @@
                 <w:szCs w:val="22"/>
                 <w:color w:val="000000"/>
               </w:rPr>
-              <w:t xml:space="preserve">-1.35</w:t>
+              <w:t xml:space="preserve">0.37</w:t>
             </w:r>
           </w:p>
         </w:tc>
@@ -11537,7 +11537,7 @@
                 <w:szCs w:val="22"/>
                 <w:color w:val="000000"/>
               </w:rPr>
-              <w:t xml:space="preserve">7.49</w:t>
+              <w:t xml:space="preserve">7.46</w:t>
             </w:r>
           </w:p>
         </w:tc>
@@ -12441,7 +12441,7 @@
                 <w:szCs w:val="22"/>
                 <w:color w:val="000000"/>
               </w:rPr>
-              <w:t xml:space="preserve">3.32</w:t>
+              <w:t xml:space="preserve">3.35</w:t>
             </w:r>
           </w:p>
         </w:tc>
@@ -13119,7 +13119,7 @@
                 <w:szCs w:val="22"/>
                 <w:color w:val="000000"/>
               </w:rPr>
-              <w:t xml:space="preserve">7.54</w:t>
+              <w:t xml:space="preserve">7.36</w:t>
             </w:r>
           </w:p>
         </w:tc>
@@ -13797,7 +13797,7 @@
                 <w:szCs w:val="22"/>
                 <w:color w:val="000000"/>
               </w:rPr>
-              <w:t xml:space="preserve">0.09</w:t>
+              <w:t xml:space="preserve">0.37</w:t>
             </w:r>
           </w:p>
         </w:tc>
@@ -14249,7 +14249,7 @@
                 <w:szCs w:val="22"/>
                 <w:color w:val="000000"/>
               </w:rPr>
-              <w:t xml:space="preserve">7.19</w:t>
+              <w:t xml:space="preserve">10.01</w:t>
             </w:r>
           </w:p>
         </w:tc>
@@ -14475,7 +14475,7 @@
                 <w:szCs w:val="22"/>
                 <w:color w:val="000000"/>
               </w:rPr>
-              <w:t xml:space="preserve">3.74</w:t>
+              <w:t xml:space="preserve">6.63</w:t>
             </w:r>
           </w:p>
         </w:tc>
@@ -14701,7 +14701,7 @@
                 <w:szCs w:val="22"/>
                 <w:color w:val="000000"/>
               </w:rPr>
-              <w:t xml:space="preserve">13.99</w:t>
+              <w:t xml:space="preserve">43.97</w:t>
             </w:r>
           </w:p>
         </w:tc>
@@ -14927,7 +14927,7 @@
                 <w:szCs w:val="22"/>
                 <w:color w:val="000000"/>
               </w:rPr>
-              <w:t xml:space="preserve">1.25</w:t>
+              <w:t xml:space="preserve">2.21</w:t>
             </w:r>
           </w:p>
         </w:tc>
@@ -15153,7 +15153,7 @@
                 <w:szCs w:val="22"/>
                 <w:color w:val="000000"/>
               </w:rPr>
-              <w:t xml:space="preserve">51.99</w:t>
+              <w:t xml:space="preserve">66.25</w:t>
             </w:r>
           </w:p>
         </w:tc>
@@ -15379,7 +15379,7 @@
                 <w:szCs w:val="22"/>
                 <w:color w:val="000000"/>
               </w:rPr>
-              <w:t xml:space="preserve">0.67</w:t>
+              <w:t xml:space="preserve">4.23</w:t>
             </w:r>
           </w:p>
         </w:tc>
@@ -15605,7 +15605,7 @@
                 <w:szCs w:val="22"/>
                 <w:color w:val="000000"/>
               </w:rPr>
-              <w:t xml:space="preserve">13.09</w:t>
+              <w:t xml:space="preserve">26.00</w:t>
             </w:r>
           </w:p>
         </w:tc>
@@ -15831,7 +15831,7 @@
                 <w:szCs w:val="22"/>
                 <w:color w:val="000000"/>
               </w:rPr>
-              <w:t xml:space="preserve">7.18</w:t>
+              <w:t xml:space="preserve">7.77</w:t>
             </w:r>
           </w:p>
         </w:tc>
@@ -16057,7 +16057,7 @@
                 <w:szCs w:val="22"/>
                 <w:color w:val="000000"/>
               </w:rPr>
-              <w:t xml:space="preserve">5.38</w:t>
+              <w:t xml:space="preserve">6.71</w:t>
             </w:r>
           </w:p>
         </w:tc>
@@ -16283,7 +16283,7 @@
                 <w:szCs w:val="22"/>
                 <w:color w:val="000000"/>
               </w:rPr>
-              <w:t xml:space="preserve">7.89</w:t>
+              <w:t xml:space="preserve">11.83</w:t>
             </w:r>
           </w:p>
         </w:tc>
@@ -16509,7 +16509,7 @@
                 <w:szCs w:val="22"/>
                 <w:color w:val="000000"/>
               </w:rPr>
-              <w:t xml:space="preserve">-0.01</w:t>
+              <w:t xml:space="preserve">1.43</w:t>
             </w:r>
           </w:p>
         </w:tc>

</xml_diff>